<commit_message>
word y botones invisibles
</commit_message>
<xml_diff>
--- a/Proyecto Programación dilexia.docx
+++ b/Proyecto Programación dilexia.docx
@@ -20,7 +20,7 @@
           <w:noProof/>
           <w:sz w:val="36"/>
           <w:szCs w:val="36"/>
-          <w:lang w:eastAsia="es-CO"/>
+          <w:lang w:val="en-US"/>
         </w:rPr>
         <w:drawing>
           <wp:anchor distT="0" distB="0" distL="114300" distR="114300" simplePos="0" relativeHeight="251662336" behindDoc="0" locked="0" layoutInCell="1" allowOverlap="1" wp14:anchorId="14E0914E" wp14:editId="06331B5F">
@@ -553,589 +553,325 @@
           <w:rFonts w:ascii="Arial" w:hAnsi="Arial" w:cs="Arial"/>
           <w:sz w:val="24"/>
           <w:szCs w:val="24"/>
-        </w:rPr>
-      </w:pPr>
-      <w:r>
-        <w:rPr>
-          <w:rFonts w:ascii="Arial" w:hAnsi="Arial" w:cs="Arial"/>
-          <w:sz w:val="24"/>
-          <w:szCs w:val="24"/>
-        </w:rPr>
-        <w:t>La dislexia es un trastorno del aprendizaje que consiste en la dificultad en la lectura debido a inconvenientes para identificar los sonidos del habla y aprender a relacionarlos con las letras y las palabras (decodificación). La dislexia, también llamada "discapacidad para la lectura", es una consecuencia de diferencias individuales en las áreas del cerebro que procesan el lenguaje.</w:t>
-      </w:r>
-    </w:p>
-    <w:p>
-      <w:pPr>
-        <w:rPr>
-          <w:rFonts w:ascii="Arial" w:hAnsi="Arial" w:cs="Arial"/>
-          <w:sz w:val="24"/>
-          <w:szCs w:val="24"/>
-        </w:rPr>
-      </w:pPr>
-      <w:r>
-        <w:rPr>
-          <w:rFonts w:ascii="Arial" w:hAnsi="Arial" w:cs="Arial"/>
-          <w:sz w:val="24"/>
-          <w:szCs w:val="24"/>
-        </w:rPr>
-        <w:t xml:space="preserve">La dislexia es un problema que puede afectar a niños de todo el mundo. Sin embargo, la prevalencia de la dislexia varía de un país a otro, y es difícil determinar con precisión cuántos niños son afectados por este trastorno </w:t>
-      </w:r>
-      <w:r>
-        <w:rPr>
-          <w:rFonts w:ascii="Arial" w:hAnsi="Arial" w:cs="Arial"/>
-          <w:sz w:val="24"/>
-          <w:szCs w:val="24"/>
-        </w:rPr>
-        <w:t>en cada país.</w:t>
-      </w:r>
-      <w:r>
-        <w:rPr>
-          <w:rFonts w:ascii="Arial" w:hAnsi="Arial" w:cs="Arial"/>
-          <w:sz w:val="24"/>
-          <w:szCs w:val="24"/>
-        </w:rPr>
-        <w:t xml:space="preserve"> Según estimaciones mundiales, un 10% de la población puede presentar dislexia, uno de los trastornos del aprendizaje más frecuente. En Fleni Escobar, se detectó que la edad promedio de consulta es de 10 años y 5 meses. La importancia de la detección temprana y qué indicadores hay que prestar atención en el desarrollo del aprendizaje de los niños.</w:t>
-      </w:r>
-    </w:p>
-    <w:p>
-      <w:pPr>
-        <w:rPr>
-          <w:rFonts w:ascii="Arial" w:hAnsi="Arial" w:cs="Arial"/>
-          <w:sz w:val="24"/>
-          <w:szCs w:val="24"/>
-        </w:rPr>
-      </w:pPr>
-      <w:r>
-        <w:rPr>
-          <w:rFonts w:ascii="Arial" w:hAnsi="Arial" w:cs="Arial"/>
-          <w:sz w:val="24"/>
-          <w:szCs w:val="24"/>
-        </w:rPr>
-        <w:t>En América Latina, la dislexia puede presentarse de diversas formas y puede afectar a personas de diferentes edades y niveles socioeconómicos. Sin embargo, debido a la falta de conciencia y recursos, muchos niños con dislexia pueden pasar desapercibidos y no recibir el diagnóstico ni el apoyo adecuados. En algunos países de América Latina, como México, Argentina, Colombia y Chile, se han establecido programas gubernamentales para apoyar a las personas con dislexia. Estos programas pueden incluir la capacitación de maestros para identificar y apoyar a los estudiantes con dislexia, así como la promoción de prácticas pedagógicas inclusivas.</w:t>
-      </w:r>
-    </w:p>
-    <w:p>
-      <w:pPr>
-        <w:rPr>
-          <w:rFonts w:ascii="Arial" w:hAnsi="Arial" w:cs="Arial"/>
-          <w:sz w:val="24"/>
-          <w:szCs w:val="24"/>
-        </w:rPr>
-      </w:pPr>
-      <w:r>
-        <w:rPr>
-          <w:rFonts w:ascii="Arial" w:hAnsi="Arial" w:cs="Arial"/>
-          <w:sz w:val="24"/>
-          <w:szCs w:val="24"/>
-        </w:rPr>
-        <w:t>Se estima que entre el 5% y el 10% de la población colombiana puede tener dislexia.</w:t>
-      </w:r>
-    </w:p>
-    <w:p>
-      <w:pPr>
-        <w:rPr>
-          <w:rFonts w:ascii="Arial" w:hAnsi="Arial" w:cs="Arial"/>
-          <w:sz w:val="24"/>
-          <w:szCs w:val="24"/>
-        </w:rPr>
-      </w:pPr>
-    </w:p>
-    <w:p>
-      <w:pPr>
-        <w:rPr>
-          <w:rFonts w:ascii="Arial" w:hAnsi="Arial" w:cs="Arial"/>
-          <w:sz w:val="24"/>
-          <w:szCs w:val="24"/>
-        </w:rPr>
-      </w:pPr>
-      <w:r>
-        <w:rPr>
-          <w:rFonts w:ascii="Arial" w:hAnsi="Arial" w:cs="Arial"/>
-          <w:sz w:val="24"/>
-          <w:szCs w:val="24"/>
-        </w:rPr>
-        <w:t>La dislexia puede manifestarse de diversas formas en Colombia y puede afectar a personas de diferentes edades y niveles socioeconómicos. Algunas de las dificultades que pueden experimentar las personas con dislexia en Colombia incluyen:</w:t>
-      </w:r>
-    </w:p>
-    <w:p>
-      <w:pPr>
-        <w:rPr>
-          <w:rFonts w:ascii="Arial" w:hAnsi="Arial" w:cs="Arial"/>
-          <w:sz w:val="24"/>
-          <w:szCs w:val="24"/>
-        </w:rPr>
-      </w:pPr>
-    </w:p>
-    <w:p>
-      <w:pPr>
-        <w:pStyle w:val="Prrafodelista"/>
-        <w:numPr>
-          <w:ilvl w:val="0"/>
-          <w:numId w:val="1"/>
-        </w:numPr>
-        <w:rPr>
-          <w:rFonts w:ascii="Arial" w:hAnsi="Arial" w:cs="Arial"/>
-          <w:sz w:val="24"/>
-          <w:szCs w:val="24"/>
-        </w:rPr>
-      </w:pPr>
-      <w:r>
-        <w:rPr>
-          <w:rFonts w:ascii="Arial" w:hAnsi="Arial" w:cs="Arial"/>
-          <w:sz w:val="24"/>
-          <w:szCs w:val="24"/>
-        </w:rPr>
-        <w:t>Dificultades para leer con fluidez y precisión</w:t>
-      </w:r>
-      <w:r>
-        <w:rPr>
-          <w:rFonts w:ascii="Arial" w:hAnsi="Arial" w:cs="Arial"/>
-          <w:sz w:val="24"/>
-          <w:szCs w:val="24"/>
-        </w:rPr>
-        <w:t>.</w:t>
-      </w:r>
-    </w:p>
-    <w:p>
-      <w:pPr>
-        <w:pStyle w:val="Prrafodelista"/>
-        <w:numPr>
-          <w:ilvl w:val="0"/>
-          <w:numId w:val="1"/>
-        </w:numPr>
-        <w:rPr>
-          <w:rFonts w:ascii="Arial" w:hAnsi="Arial" w:cs="Arial"/>
-          <w:sz w:val="24"/>
-          <w:szCs w:val="24"/>
-        </w:rPr>
-      </w:pPr>
-      <w:r>
-        <w:rPr>
-          <w:rFonts w:ascii="Arial" w:hAnsi="Arial" w:cs="Arial"/>
-          <w:sz w:val="24"/>
-          <w:szCs w:val="24"/>
-        </w:rPr>
-        <w:t>Problemas para comprender lo que se lee</w:t>
-      </w:r>
-      <w:r>
-        <w:rPr>
-          <w:rFonts w:ascii="Arial" w:hAnsi="Arial" w:cs="Arial"/>
-          <w:sz w:val="24"/>
-          <w:szCs w:val="24"/>
-        </w:rPr>
-        <w:t>.</w:t>
-      </w:r>
-    </w:p>
-    <w:p>
-      <w:pPr>
-        <w:pStyle w:val="Prrafodelista"/>
-        <w:numPr>
-          <w:ilvl w:val="0"/>
-          <w:numId w:val="1"/>
-        </w:numPr>
-        <w:rPr>
-          <w:rFonts w:ascii="Arial" w:hAnsi="Arial" w:cs="Arial"/>
-          <w:sz w:val="24"/>
-          <w:szCs w:val="24"/>
-        </w:rPr>
-      </w:pPr>
-      <w:r>
-        <w:rPr>
-          <w:rFonts w:ascii="Arial" w:hAnsi="Arial" w:cs="Arial"/>
-          <w:sz w:val="24"/>
-          <w:szCs w:val="24"/>
-        </w:rPr>
-        <w:t>Dificultades para escribir correctamente y organizar ideas por escrito</w:t>
-      </w:r>
-      <w:r>
-        <w:rPr>
-          <w:rFonts w:ascii="Arial" w:hAnsi="Arial" w:cs="Arial"/>
-          <w:sz w:val="24"/>
-          <w:szCs w:val="24"/>
-        </w:rPr>
-        <w:t>.</w:t>
-      </w:r>
-    </w:p>
-    <w:p>
-      <w:pPr>
-        <w:pStyle w:val="Prrafodelista"/>
-        <w:numPr>
-          <w:ilvl w:val="0"/>
-          <w:numId w:val="1"/>
-        </w:numPr>
-        <w:rPr>
-          <w:rFonts w:ascii="Arial" w:hAnsi="Arial" w:cs="Arial"/>
-          <w:sz w:val="24"/>
-          <w:szCs w:val="24"/>
-        </w:rPr>
-      </w:pPr>
-      <w:r>
-        <w:rPr>
-          <w:rFonts w:ascii="Arial" w:hAnsi="Arial" w:cs="Arial"/>
-          <w:sz w:val="24"/>
-          <w:szCs w:val="24"/>
-        </w:rPr>
-        <w:t>Dificultades para aprender y recordar las reglas ortográficas</w:t>
-      </w:r>
-      <w:r>
-        <w:rPr>
-          <w:rFonts w:ascii="Arial" w:hAnsi="Arial" w:cs="Arial"/>
-          <w:sz w:val="24"/>
-          <w:szCs w:val="24"/>
-        </w:rPr>
-        <w:t>.</w:t>
-      </w:r>
-    </w:p>
-    <w:p>
-      <w:pPr>
-        <w:pStyle w:val="Prrafodelista"/>
-        <w:numPr>
-          <w:ilvl w:val="0"/>
-          <w:numId w:val="1"/>
-        </w:numPr>
-        <w:rPr>
-          <w:rFonts w:ascii="Arial" w:hAnsi="Arial" w:cs="Arial"/>
-          <w:sz w:val="24"/>
-          <w:szCs w:val="24"/>
-        </w:rPr>
-      </w:pPr>
-      <w:r>
-        <w:rPr>
-          <w:rFonts w:ascii="Arial" w:hAnsi="Arial" w:cs="Arial"/>
-          <w:sz w:val="24"/>
-          <w:szCs w:val="24"/>
-        </w:rPr>
-        <w:t>Dificultades para seguir instrucciones y recordar información verbalmente</w:t>
-      </w:r>
-      <w:r>
-        <w:rPr>
-          <w:rFonts w:ascii="Arial" w:hAnsi="Arial" w:cs="Arial"/>
-          <w:sz w:val="24"/>
-          <w:szCs w:val="24"/>
-        </w:rPr>
-        <w:t>.</w:t>
-      </w:r>
-    </w:p>
-    <w:p/>
-    <w:p/>
-    <w:p>
-      <w:pPr>
-        <w:rPr>
-          <w:rFonts w:ascii="Arial" w:hAnsi="Arial" w:cs="Arial"/>
-          <w:sz w:val="24"/>
-          <w:szCs w:val="24"/>
-        </w:rPr>
-      </w:pPr>
-      <w:r>
-        <w:rPr>
-          <w:rFonts w:ascii="Arial" w:hAnsi="Arial" w:cs="Arial"/>
-          <w:sz w:val="24"/>
-          <w:szCs w:val="24"/>
+          <w:lang w:val="es-MX"/>
+        </w:rPr>
+      </w:pPr>
+      <w:r>
+        <w:rPr>
+          <w:rFonts w:ascii="Arial" w:hAnsi="Arial" w:cs="Arial"/>
+          <w:sz w:val="24"/>
+          <w:szCs w:val="24"/>
+          <w:lang w:val="es-MX"/>
+        </w:rPr>
+        <w:t xml:space="preserve">La dislexia es una discapacidad de aprendizaje que afecta a muchas personas en todo el mundo. Según la Asociación Internacional de Dislexia (IDA), alrededor del 10 por ciento de la población mundial tiene algún grado de dislexia. Esta condición se caracteriza por dificultad para leer, escribir y deletrear a pesar </w:t>
+      </w:r>
+      <w:proofErr w:type="gramStart"/>
+      <w:r>
+        <w:rPr>
+          <w:rFonts w:ascii="Arial" w:hAnsi="Arial" w:cs="Arial"/>
+          <w:sz w:val="24"/>
+          <w:szCs w:val="24"/>
+          <w:lang w:val="es-MX"/>
+        </w:rPr>
+        <w:t>de  una</w:t>
+      </w:r>
+      <w:proofErr w:type="gramEnd"/>
+      <w:r>
+        <w:rPr>
+          <w:rFonts w:ascii="Arial" w:hAnsi="Arial" w:cs="Arial"/>
+          <w:sz w:val="24"/>
+          <w:szCs w:val="24"/>
+          <w:lang w:val="es-MX"/>
+        </w:rPr>
+        <w:t xml:space="preserve"> inteligencia normal y la ausencia de trastornos físicos o neurológicos. La dislexia puede tener un impacto significativo en la vida de las personas, afectando su rendimiento académico, confianza en sí mismos</w:t>
+      </w:r>
+      <w:r>
+        <w:rPr>
+          <w:rFonts w:ascii="Arial" w:hAnsi="Arial" w:cs="Arial"/>
+          <w:sz w:val="24"/>
+          <w:szCs w:val="24"/>
+          <w:lang w:val="es-MX"/>
+        </w:rPr>
+        <w:t xml:space="preserve"> y calidad de vida en general.</w:t>
+      </w:r>
+    </w:p>
+    <w:p>
+      <w:pPr>
+        <w:rPr>
+          <w:rFonts w:ascii="Arial" w:hAnsi="Arial" w:cs="Arial"/>
+          <w:sz w:val="24"/>
+          <w:szCs w:val="24"/>
+          <w:lang w:val="es-MX"/>
+        </w:rPr>
+      </w:pPr>
+      <w:r>
+        <w:rPr>
+          <w:rFonts w:ascii="Arial" w:hAnsi="Arial" w:cs="Arial"/>
+          <w:sz w:val="24"/>
+          <w:szCs w:val="24"/>
+          <w:lang w:val="es-MX"/>
+        </w:rPr>
+        <w:t xml:space="preserve">En América Latina, la dislexia también es un problema reconocido que afecta a varios países de la región. Por ejemplo, estudios </w:t>
+      </w:r>
+      <w:proofErr w:type="gramStart"/>
+      <w:r>
+        <w:rPr>
+          <w:rFonts w:ascii="Arial" w:hAnsi="Arial" w:cs="Arial"/>
+          <w:sz w:val="24"/>
+          <w:szCs w:val="24"/>
+          <w:lang w:val="es-MX"/>
+        </w:rPr>
+        <w:t>en  México</w:t>
+      </w:r>
+      <w:proofErr w:type="gramEnd"/>
+      <w:r>
+        <w:rPr>
+          <w:rFonts w:ascii="Arial" w:hAnsi="Arial" w:cs="Arial"/>
+          <w:sz w:val="24"/>
+          <w:szCs w:val="24"/>
+          <w:lang w:val="es-MX"/>
+        </w:rPr>
+        <w:t xml:space="preserve">, Argentina y Brasil muestran que del 5 al 10 por ciento de los niños tienen síntomas de dislexia. Estos datos muestran que la dislexia es un problema grave en América Latina y que se necesita más reconocimiento y apoyo para las personas que la padecen. Es importante fortalecer la conciencia pública sobre la dislexia y garantizar que la región tenga suficientes recursos y estrategias </w:t>
+      </w:r>
+      <w:proofErr w:type="gramStart"/>
+      <w:r>
+        <w:rPr>
+          <w:rFonts w:ascii="Arial" w:hAnsi="Arial" w:cs="Arial"/>
+          <w:sz w:val="24"/>
+          <w:szCs w:val="24"/>
+          <w:lang w:val="es-MX"/>
+        </w:rPr>
+        <w:t>educati</w:t>
+      </w:r>
+      <w:r>
+        <w:rPr>
+          <w:rFonts w:ascii="Arial" w:hAnsi="Arial" w:cs="Arial"/>
+          <w:sz w:val="24"/>
+          <w:szCs w:val="24"/>
+          <w:lang w:val="es-MX"/>
+        </w:rPr>
+        <w:t>vas  para</w:t>
+      </w:r>
+      <w:proofErr w:type="gramEnd"/>
+      <w:r>
+        <w:rPr>
+          <w:rFonts w:ascii="Arial" w:hAnsi="Arial" w:cs="Arial"/>
+          <w:sz w:val="24"/>
+          <w:szCs w:val="24"/>
+          <w:lang w:val="es-MX"/>
+        </w:rPr>
+        <w:t xml:space="preserve"> abordar  la afección.</w:t>
+      </w:r>
+    </w:p>
+    <w:p>
+      <w:pPr>
+        <w:rPr>
+          <w:rFonts w:ascii="Arial" w:hAnsi="Arial" w:cs="Arial"/>
+          <w:sz w:val="24"/>
+          <w:szCs w:val="24"/>
+          <w:lang w:val="es-MX"/>
+        </w:rPr>
+      </w:pPr>
+      <w:r>
+        <w:rPr>
+          <w:rFonts w:ascii="Arial" w:hAnsi="Arial" w:cs="Arial"/>
+          <w:sz w:val="24"/>
+          <w:szCs w:val="24"/>
+          <w:lang w:val="es-MX"/>
+        </w:rPr>
+        <w:t>En el caso específico de Colombia, la dislexia también es un problema reconocido que se presenta en diferentes regiones del país. Aunque no existen datos exactos sobre la prevalencia de la dislexia en Colombia, la enfermedad puede afectar a un porcentaje importante de la población. Sin embargo, la falta de concientización y de recursos adecuados para identificar y tratar la dislexia impide el acceso a un diagnóstico temprano y una adecuada intervención educativa en Colombia. Existe la necesidad de impulsar políticas y programas que promuevan la detección temprana y el apoyo integral a la dislexia en el sistema educativo colombiano.</w:t>
+      </w:r>
+    </w:p>
+    <w:p>
+      <w:pPr>
+        <w:rPr>
+          <w:rFonts w:ascii="Arial" w:hAnsi="Arial" w:cs="Arial"/>
+          <w:sz w:val="24"/>
+          <w:szCs w:val="24"/>
+          <w:lang w:val="es-MX"/>
+        </w:rPr>
+      </w:pPr>
+      <w:r>
+        <w:rPr>
+          <w:rFonts w:ascii="Arial" w:hAnsi="Arial" w:cs="Arial"/>
+          <w:sz w:val="24"/>
+          <w:szCs w:val="24"/>
+          <w:lang w:val="es-MX"/>
+        </w:rPr>
+        <w:t xml:space="preserve">La dislexia perceptual afecta a personas de diferentes grupos de población. Esto es particularmente importante para los niños en edad escolar, ya que las dificultades para leer y escribir pueden tener un impacto significativo en su desempeño académico y desarrollo personal. Pero la dislexia no se limita a la infancia; También puede afectar a jóvenes y adultos, dificultando su </w:t>
+      </w:r>
+      <w:r>
+        <w:rPr>
+          <w:rFonts w:ascii="Arial" w:hAnsi="Arial" w:cs="Arial"/>
+          <w:sz w:val="24"/>
+          <w:szCs w:val="24"/>
+          <w:lang w:val="es-MX"/>
+        </w:rPr>
+        <w:t>desempeño laboral</w:t>
+      </w:r>
+      <w:r>
+        <w:rPr>
+          <w:rFonts w:ascii="Arial" w:hAnsi="Arial" w:cs="Arial"/>
+          <w:sz w:val="24"/>
+          <w:szCs w:val="24"/>
+          <w:lang w:val="es-MX"/>
+        </w:rPr>
+        <w:t xml:space="preserve"> y su plena </w:t>
+      </w:r>
+      <w:r>
+        <w:rPr>
+          <w:rFonts w:ascii="Arial" w:hAnsi="Arial" w:cs="Arial"/>
+          <w:sz w:val="24"/>
+          <w:szCs w:val="24"/>
+          <w:lang w:val="es-MX"/>
+        </w:rPr>
+        <w:t>participación en</w:t>
+      </w:r>
+      <w:r>
+        <w:rPr>
+          <w:rFonts w:ascii="Arial" w:hAnsi="Arial" w:cs="Arial"/>
+          <w:sz w:val="24"/>
+          <w:szCs w:val="24"/>
+          <w:lang w:val="es-MX"/>
+        </w:rPr>
+        <w:t xml:space="preserve"> la sociedad. Es importante comprender que la dislexia no indica falta de inteligencia, sino una diferencia en la forma en que el cerebro procesa y </w:t>
+      </w:r>
+      <w:r>
+        <w:rPr>
+          <w:rFonts w:ascii="Arial" w:hAnsi="Arial" w:cs="Arial"/>
+          <w:sz w:val="24"/>
+          <w:szCs w:val="24"/>
+          <w:lang w:val="es-MX"/>
+        </w:rPr>
+        <w:t xml:space="preserve">comprende el lenguaje escrito. </w:t>
+      </w:r>
+    </w:p>
+    <w:p>
+      <w:pPr>
+        <w:rPr>
+          <w:rFonts w:ascii="Arial" w:hAnsi="Arial" w:cs="Arial"/>
+          <w:sz w:val="24"/>
+          <w:szCs w:val="24"/>
+          <w:lang w:val="es-MX"/>
+        </w:rPr>
+      </w:pPr>
+      <w:r>
+        <w:rPr>
+          <w:rFonts w:ascii="Arial" w:hAnsi="Arial" w:cs="Arial"/>
+          <w:sz w:val="24"/>
+          <w:szCs w:val="24"/>
+          <w:lang w:val="es-MX"/>
+        </w:rPr>
+        <w:t xml:space="preserve">Las causas de la dislexia aún no se conocen por completo, pero se cree que tienen un origen multifactorial. Se ha demostrado una fuerte influencia genética en el desarrollo de la dislexia, y los estudios muestran que los niños con dislexia tienen más probabilidades de desarrollar la afección. Además de los factores genéticos, se han identificado aspectos neurobiológicos que pueden influir en la dislexia, como diferencias en la estructura y función del cerebro en áreas relacionadas con el procesamiento del lenguaje y la lectura. Además, factores ambientales y educativos como la falta de concienciación y formación de los </w:t>
+      </w:r>
+      <w:r>
+        <w:rPr>
+          <w:rFonts w:ascii="Arial" w:hAnsi="Arial" w:cs="Arial"/>
+          <w:sz w:val="24"/>
+          <w:szCs w:val="24"/>
+          <w:lang w:val="es-MX"/>
         </w:rPr>
         <w:lastRenderedPageBreak/>
-        <w:t>La dislexia es un trastorno del aprendizaje que afecta la capacidad de una persona para leer con fluidez y precisión. Aunque las causas exactas de la dislexia no se conocen completamente, se cree que hay una combinación de factores genéticos y ambientales que contribuyen al desarrollo del trastorno.</w:t>
-      </w:r>
-    </w:p>
-    <w:p>
-      <w:pPr>
-        <w:rPr>
-          <w:rFonts w:ascii="Arial" w:hAnsi="Arial" w:cs="Arial"/>
-          <w:sz w:val="24"/>
-          <w:szCs w:val="24"/>
-        </w:rPr>
-      </w:pPr>
-      <w:r>
-        <w:rPr>
-          <w:rFonts w:ascii="Arial" w:hAnsi="Arial" w:cs="Arial"/>
-          <w:sz w:val="24"/>
-          <w:szCs w:val="24"/>
-        </w:rPr>
-        <w:t>Algunas posibles causas</w:t>
-      </w:r>
-      <w:r>
-        <w:rPr>
-          <w:rFonts w:ascii="Arial" w:hAnsi="Arial" w:cs="Arial"/>
-          <w:sz w:val="24"/>
-          <w:szCs w:val="24"/>
-        </w:rPr>
-        <w:t xml:space="preserve"> de la dislexia pueden incluir:</w:t>
-      </w:r>
-    </w:p>
-    <w:p>
-      <w:pPr>
-        <w:pStyle w:val="Prrafodelista"/>
-        <w:numPr>
-          <w:ilvl w:val="0"/>
-          <w:numId w:val="1"/>
-        </w:numPr>
-        <w:rPr>
-          <w:rFonts w:ascii="Arial" w:hAnsi="Arial" w:cs="Arial"/>
-          <w:sz w:val="24"/>
-          <w:szCs w:val="24"/>
-        </w:rPr>
-      </w:pPr>
-      <w:r>
-        <w:rPr>
-          <w:rFonts w:ascii="Arial" w:hAnsi="Arial" w:cs="Arial"/>
-          <w:sz w:val="24"/>
-          <w:szCs w:val="24"/>
-        </w:rPr>
-        <w:t>Genética: se ha demostrado que la dislexia tiene una fuerte base genética, lo que significa que es más probable que un niño desarrolle dislexia si tiene un padre o un familiar cercano con el trastorno.</w:t>
-      </w:r>
-    </w:p>
-    <w:p>
-      <w:pPr>
-        <w:rPr>
-          <w:rFonts w:ascii="Arial" w:hAnsi="Arial" w:cs="Arial"/>
-          <w:sz w:val="24"/>
-          <w:szCs w:val="24"/>
-        </w:rPr>
-      </w:pPr>
-    </w:p>
-    <w:p>
-      <w:pPr>
-        <w:pStyle w:val="Prrafodelista"/>
-        <w:numPr>
-          <w:ilvl w:val="0"/>
-          <w:numId w:val="1"/>
-        </w:numPr>
-        <w:rPr>
-          <w:rFonts w:ascii="Arial" w:hAnsi="Arial" w:cs="Arial"/>
-          <w:sz w:val="24"/>
-          <w:szCs w:val="24"/>
-        </w:rPr>
-      </w:pPr>
-      <w:r>
-        <w:rPr>
-          <w:rFonts w:ascii="Arial" w:hAnsi="Arial" w:cs="Arial"/>
-          <w:sz w:val="24"/>
-          <w:szCs w:val="24"/>
-        </w:rPr>
-        <w:t>Anomalías cerebrales: se ha observado que las personas con dislexia tienen diferencias en la forma en que sus cerebros procesan el lenguaje y la lectura. Estas diferencias pueden ser el resultado de anomalías estructurales o funcionales en el cerebro.</w:t>
-      </w:r>
-    </w:p>
-    <w:p>
-      <w:pPr>
-        <w:rPr>
-          <w:rFonts w:ascii="Arial" w:hAnsi="Arial" w:cs="Arial"/>
-          <w:sz w:val="24"/>
-          <w:szCs w:val="24"/>
-        </w:rPr>
-      </w:pPr>
-    </w:p>
-    <w:p>
-      <w:pPr>
-        <w:pStyle w:val="Prrafodelista"/>
-        <w:numPr>
-          <w:ilvl w:val="0"/>
-          <w:numId w:val="1"/>
-        </w:numPr>
-        <w:rPr>
-          <w:rFonts w:ascii="Arial" w:hAnsi="Arial" w:cs="Arial"/>
-          <w:sz w:val="24"/>
-          <w:szCs w:val="24"/>
-        </w:rPr>
-      </w:pPr>
-      <w:r>
-        <w:rPr>
-          <w:rFonts w:ascii="Arial" w:hAnsi="Arial" w:cs="Arial"/>
-          <w:sz w:val="24"/>
-          <w:szCs w:val="24"/>
-        </w:rPr>
-        <w:t>Factores ambientales: ciertos factores ambientales, como la exposición prenatal al alcohol o al tabaco, pueden aumentar el riesgo de dislexia.</w:t>
-      </w:r>
-    </w:p>
-    <w:p>
-      <w:pPr>
-        <w:pStyle w:val="Prrafodelista"/>
-        <w:rPr>
-          <w:rFonts w:ascii="Arial" w:hAnsi="Arial" w:cs="Arial"/>
-          <w:sz w:val="24"/>
-          <w:szCs w:val="24"/>
-        </w:rPr>
-      </w:pPr>
-    </w:p>
-    <w:p>
-      <w:pPr>
-        <w:pStyle w:val="Prrafodelista"/>
-        <w:rPr>
-          <w:rFonts w:ascii="Arial" w:hAnsi="Arial" w:cs="Arial"/>
-          <w:sz w:val="24"/>
-          <w:szCs w:val="24"/>
-        </w:rPr>
-      </w:pPr>
-    </w:p>
-    <w:p>
-      <w:pPr>
-        <w:pStyle w:val="Prrafodelista"/>
-        <w:numPr>
-          <w:ilvl w:val="0"/>
-          <w:numId w:val="1"/>
-        </w:numPr>
-        <w:rPr>
-          <w:rFonts w:ascii="Arial" w:hAnsi="Arial" w:cs="Arial"/>
-          <w:sz w:val="24"/>
-          <w:szCs w:val="24"/>
-        </w:rPr>
-      </w:pPr>
-      <w:r>
-        <w:rPr>
-          <w:rFonts w:ascii="Arial" w:hAnsi="Arial" w:cs="Arial"/>
-          <w:sz w:val="24"/>
-          <w:szCs w:val="24"/>
-        </w:rPr>
-        <w:t>Problemas de audición o visión: la dislexia también pu</w:t>
-      </w:r>
-      <w:r>
-        <w:rPr>
-          <w:rFonts w:ascii="Arial" w:hAnsi="Arial" w:cs="Arial"/>
-          <w:sz w:val="24"/>
-          <w:szCs w:val="24"/>
-        </w:rPr>
-        <w:t>ede ser causada por problemas en</w:t>
-      </w:r>
-      <w:r>
-        <w:rPr>
-          <w:rFonts w:ascii="Arial" w:hAnsi="Arial" w:cs="Arial"/>
-          <w:sz w:val="24"/>
-          <w:szCs w:val="24"/>
-        </w:rPr>
-        <w:t xml:space="preserve"> audición o </w:t>
-      </w:r>
-      <w:r>
-        <w:rPr>
-          <w:rFonts w:ascii="Arial" w:hAnsi="Arial" w:cs="Arial"/>
-          <w:sz w:val="24"/>
-          <w:szCs w:val="24"/>
-        </w:rPr>
-        <w:t xml:space="preserve">en </w:t>
-      </w:r>
-      <w:r>
-        <w:rPr>
-          <w:rFonts w:ascii="Arial" w:hAnsi="Arial" w:cs="Arial"/>
-          <w:sz w:val="24"/>
-          <w:szCs w:val="24"/>
-        </w:rPr>
-        <w:t>visión que interfieren con la capacidad de una persona para procesar el lenguaje escrito.</w:t>
-      </w:r>
-    </w:p>
-    <w:p>
-      <w:pPr>
-        <w:pStyle w:val="Prrafodelista"/>
-        <w:rPr>
-          <w:rFonts w:ascii="Arial" w:hAnsi="Arial" w:cs="Arial"/>
-          <w:sz w:val="24"/>
-          <w:szCs w:val="24"/>
-        </w:rPr>
-      </w:pPr>
-    </w:p>
-    <w:p>
-      <w:pPr>
-        <w:rPr>
-          <w:rFonts w:ascii="Arial" w:hAnsi="Arial" w:cs="Arial"/>
-          <w:sz w:val="24"/>
-          <w:szCs w:val="24"/>
-        </w:rPr>
-      </w:pPr>
-      <w:r>
-        <w:rPr>
-          <w:rFonts w:ascii="Arial" w:hAnsi="Arial" w:cs="Arial"/>
-          <w:sz w:val="24"/>
-          <w:szCs w:val="24"/>
-        </w:rPr>
-        <w:t>Es importante tener en cuenta que la dislexia es un trastorno complejo y que su desarrollo probablemente se debe a la interacción de varios factores.</w:t>
-      </w:r>
-    </w:p>
-    <w:p>
-      <w:pPr>
-        <w:rPr>
-          <w:rFonts w:ascii="Arial" w:hAnsi="Arial" w:cs="Arial"/>
-          <w:sz w:val="24"/>
-          <w:szCs w:val="24"/>
-        </w:rPr>
-      </w:pPr>
-    </w:p>
-    <w:p>
-      <w:pPr>
-        <w:rPr>
-          <w:rFonts w:ascii="Arial" w:hAnsi="Arial" w:cs="Arial"/>
-          <w:sz w:val="24"/>
-          <w:szCs w:val="24"/>
-        </w:rPr>
-      </w:pPr>
-      <w:r>
-        <w:rPr>
-          <w:rFonts w:ascii="Arial" w:hAnsi="Arial" w:cs="Arial"/>
-          <w:sz w:val="24"/>
-          <w:szCs w:val="24"/>
-        </w:rPr>
-        <w:t xml:space="preserve">El propósito de nuestro proyecto es incentivar y ayudar a los niños y adultos con dislexia mediante </w:t>
-      </w:r>
-      <w:r>
-        <w:rPr>
-          <w:rFonts w:ascii="Arial" w:hAnsi="Arial" w:cs="Arial"/>
-          <w:sz w:val="24"/>
-          <w:szCs w:val="24"/>
-        </w:rPr>
-        <w:t>un programa</w:t>
-      </w:r>
-      <w:r>
-        <w:rPr>
-          <w:rFonts w:ascii="Arial" w:hAnsi="Arial" w:cs="Arial"/>
-          <w:sz w:val="24"/>
-          <w:szCs w:val="24"/>
-        </w:rPr>
-        <w:t xml:space="preserve"> en </w:t>
-      </w:r>
-      <w:r>
-        <w:rPr>
-          <w:rFonts w:ascii="Arial" w:hAnsi="Arial" w:cs="Arial"/>
-          <w:sz w:val="24"/>
-          <w:szCs w:val="24"/>
-        </w:rPr>
-        <w:t>java. El</w:t>
-      </w:r>
-      <w:r>
-        <w:rPr>
-          <w:rFonts w:ascii="Arial" w:hAnsi="Arial" w:cs="Arial"/>
-          <w:sz w:val="24"/>
-          <w:szCs w:val="24"/>
-        </w:rPr>
-        <w:t xml:space="preserve"> programa contara con actividades y juegos didácticos </w:t>
-      </w:r>
-      <w:r>
-        <w:rPr>
-          <w:rFonts w:ascii="Arial" w:hAnsi="Arial" w:cs="Arial"/>
-          <w:sz w:val="24"/>
-          <w:szCs w:val="24"/>
-        </w:rPr>
-        <w:t>que ayudaran a las personas con dislexia a procesar y entender mejor las palabras y les ayude a escribir mejo</w:t>
-      </w:r>
-      <w:r>
-        <w:rPr>
-          <w:rFonts w:ascii="Arial" w:hAnsi="Arial" w:cs="Arial"/>
-          <w:sz w:val="24"/>
-          <w:szCs w:val="24"/>
-        </w:rPr>
-        <w:t>r</w:t>
-      </w:r>
-      <w:r>
-        <w:rPr>
-          <w:rFonts w:ascii="Arial" w:hAnsi="Arial" w:cs="Arial"/>
-          <w:sz w:val="24"/>
-          <w:szCs w:val="24"/>
-        </w:rPr>
-        <w:t>.</w:t>
-      </w:r>
-    </w:p>
-    <w:p>
-      <w:pPr>
-        <w:rPr>
-          <w:rFonts w:ascii="Arial" w:hAnsi="Arial" w:cs="Arial"/>
-          <w:sz w:val="24"/>
-          <w:szCs w:val="24"/>
-        </w:rPr>
-      </w:pPr>
+        <w:t xml:space="preserve">educadores pueden contribuir a la detección tardía de la dislexia </w:t>
+      </w:r>
+      <w:proofErr w:type="gramStart"/>
+      <w:r>
+        <w:rPr>
+          <w:rFonts w:ascii="Arial" w:hAnsi="Arial" w:cs="Arial"/>
+          <w:sz w:val="24"/>
+          <w:szCs w:val="24"/>
+          <w:lang w:val="es-MX"/>
+        </w:rPr>
+        <w:t>y  la</w:t>
+      </w:r>
+      <w:proofErr w:type="gramEnd"/>
+      <w:r>
+        <w:rPr>
+          <w:rFonts w:ascii="Arial" w:hAnsi="Arial" w:cs="Arial"/>
+          <w:sz w:val="24"/>
+          <w:szCs w:val="24"/>
+          <w:lang w:val="es-MX"/>
+        </w:rPr>
+        <w:t xml:space="preserve"> falta de apoyo adecuado. Las consecuencias de no tratar la disl</w:t>
+      </w:r>
+      <w:r>
+        <w:rPr>
+          <w:rFonts w:ascii="Arial" w:hAnsi="Arial" w:cs="Arial"/>
+          <w:sz w:val="24"/>
+          <w:szCs w:val="24"/>
+          <w:lang w:val="es-MX"/>
+        </w:rPr>
+        <w:t>exia pueden ser significativas.</w:t>
+      </w:r>
+    </w:p>
+    <w:p>
+      <w:pPr>
+        <w:rPr>
+          <w:rFonts w:ascii="Arial" w:hAnsi="Arial" w:cs="Arial"/>
+          <w:sz w:val="24"/>
+          <w:szCs w:val="24"/>
+          <w:lang w:val="es-MX"/>
+        </w:rPr>
+      </w:pPr>
+      <w:r>
+        <w:rPr>
+          <w:rFonts w:ascii="Arial" w:hAnsi="Arial" w:cs="Arial"/>
+          <w:sz w:val="24"/>
+          <w:szCs w:val="24"/>
+          <w:lang w:val="es-MX"/>
+        </w:rPr>
+        <w:t>Las personas con dislexia pueden tener dificultades continuas en el rendimiento académico, lo que puede afectar su autoestima, motivación y desarrollo de habilidades básicas. Sin el apoyo adecuado, pueden experimentar barreras para el aprendizaje que pueden limitar su acceso a oportunidades educativas y laborales. Además, la falta de conciencia y recursos para tratar la dislexia puede perpetuar la desigualdad y la discriminación en la educación y el trabajo. Es importante promover la concienciación, educación y apoyo a las personas con dislexia para asegurar su plena inclusión y desarrollo en la sociedad.</w:t>
+      </w:r>
+    </w:p>
+    <w:p>
+      <w:pPr>
+        <w:rPr>
+          <w:rFonts w:ascii="Arial" w:hAnsi="Arial" w:cs="Arial"/>
+          <w:sz w:val="24"/>
+          <w:szCs w:val="24"/>
+          <w:lang w:val="es-MX"/>
+        </w:rPr>
+      </w:pPr>
+      <w:r>
+        <w:rPr>
+          <w:rFonts w:ascii="Arial" w:hAnsi="Arial" w:cs="Arial"/>
+          <w:sz w:val="24"/>
+          <w:szCs w:val="24"/>
+          <w:lang w:val="es-MX"/>
+        </w:rPr>
+        <w:t xml:space="preserve">Nuestro objetivo es implementar una aplicación </w:t>
+      </w:r>
+      <w:proofErr w:type="spellStart"/>
+      <w:r>
+        <w:rPr>
+          <w:rFonts w:ascii="Arial" w:hAnsi="Arial" w:cs="Arial"/>
+          <w:sz w:val="24"/>
+          <w:szCs w:val="24"/>
+          <w:lang w:val="es-MX"/>
+        </w:rPr>
+        <w:t>utilzando</w:t>
+      </w:r>
+      <w:proofErr w:type="spellEnd"/>
+      <w:r>
+        <w:rPr>
+          <w:rFonts w:ascii="Arial" w:hAnsi="Arial" w:cs="Arial"/>
+          <w:sz w:val="24"/>
+          <w:szCs w:val="24"/>
+          <w:lang w:val="es-MX"/>
+        </w:rPr>
+        <w:t xml:space="preserve"> el lenguaje de programación Java</w:t>
+      </w:r>
+      <w:r>
+        <w:rPr>
+          <w:rFonts w:ascii="Arial" w:hAnsi="Arial" w:cs="Arial"/>
+          <w:sz w:val="24"/>
+          <w:szCs w:val="24"/>
+          <w:lang w:val="es-MX"/>
+        </w:rPr>
+        <w:t xml:space="preserve">, que tenga como finalidad brindar una serie de juegos didácticos </w:t>
+      </w:r>
+      <w:bookmarkStart w:id="2" w:name="_GoBack"/>
+      <w:bookmarkEnd w:id="2"/>
     </w:p>
     <w:p>
       <w:pPr>
@@ -1316,6 +1052,7 @@
           <w:sz w:val="24"/>
           <w:szCs w:val="24"/>
         </w:rPr>
+        <w:lastRenderedPageBreak/>
         <w:t>Es importante recordar que cada persona con dislexia es única y tiene necesidades y habilidades diferentes, por lo que la aplicación deberá adaptarse a las necesidades específicas de su público objetivo.</w:t>
       </w:r>
     </w:p>
@@ -1573,135 +1310,6 @@
         </w:rPr>
         <w:t>Marco teórico.</w:t>
       </w:r>
-    </w:p>
-    <w:p>
-      <w:pPr>
-        <w:rPr>
-          <w:rFonts w:ascii="Arial" w:hAnsi="Arial" w:cs="Arial"/>
-          <w:sz w:val="24"/>
-          <w:szCs w:val="24"/>
-        </w:rPr>
-      </w:pPr>
-      <w:r>
-        <w:rPr>
-          <w:rFonts w:ascii="Arial" w:hAnsi="Arial" w:cs="Arial"/>
-          <w:sz w:val="24"/>
-          <w:szCs w:val="24"/>
-        </w:rPr>
-        <w:t>-</w:t>
-      </w:r>
-      <w:r>
-        <w:rPr>
-          <w:rFonts w:ascii="Arial" w:hAnsi="Arial" w:cs="Arial"/>
-          <w:sz w:val="24"/>
-          <w:szCs w:val="24"/>
-        </w:rPr>
-        <w:t>Sobre el asunto del problema o necesidad a resolver:</w:t>
-      </w:r>
-    </w:p>
-    <w:p>
-      <w:pPr>
-        <w:rPr>
-          <w:rFonts w:ascii="Arial" w:hAnsi="Arial" w:cs="Arial"/>
-          <w:sz w:val="24"/>
-          <w:szCs w:val="24"/>
-        </w:rPr>
-      </w:pPr>
-    </w:p>
-    <w:p>
-      <w:pPr>
-        <w:rPr>
-          <w:rFonts w:ascii="Arial" w:hAnsi="Arial" w:cs="Arial"/>
-          <w:sz w:val="24"/>
-          <w:szCs w:val="24"/>
-        </w:rPr>
-      </w:pPr>
-      <w:r>
-        <w:rPr>
-          <w:rFonts w:ascii="Arial" w:hAnsi="Arial" w:cs="Arial"/>
-          <w:sz w:val="24"/>
-          <w:szCs w:val="24"/>
-        </w:rPr>
-        <w:t>La dislexia es un trastorno del aprendizaje que afecta a la habilidad de una persona para leer, escribir y deletrear correctamente. Esta dificultad puede afectar el desempeño académico y la autoestima de la persona, ya que puede llevar a un retraso en el aprendizaje y a la frustración. Por lo tanto, es importante contar con herramientas y recursos que puedan ayudar a las personas con dislexia a superar estas dificultades y mejorar sus habilidades de lectura y escritura.</w:t>
-      </w:r>
-    </w:p>
-    <w:p>
-      <w:pPr>
-        <w:rPr>
-          <w:rFonts w:ascii="Arial" w:hAnsi="Arial" w:cs="Arial"/>
-          <w:sz w:val="24"/>
-          <w:szCs w:val="24"/>
-        </w:rPr>
-      </w:pPr>
-    </w:p>
-    <w:p>
-      <w:pPr>
-        <w:rPr>
-          <w:rFonts w:ascii="Arial" w:hAnsi="Arial" w:cs="Arial"/>
-          <w:sz w:val="24"/>
-          <w:szCs w:val="24"/>
-        </w:rPr>
-      </w:pPr>
-      <w:r>
-        <w:rPr>
-          <w:rFonts w:ascii="Arial" w:hAnsi="Arial" w:cs="Arial"/>
-          <w:sz w:val="24"/>
-          <w:szCs w:val="24"/>
-        </w:rPr>
-        <w:t>-</w:t>
-      </w:r>
-      <w:r>
-        <w:rPr>
-          <w:rFonts w:ascii="Arial" w:hAnsi="Arial" w:cs="Arial"/>
-          <w:sz w:val="24"/>
-          <w:szCs w:val="24"/>
-        </w:rPr>
-        <w:t>Sobre Programación Orientada a Objetos:</w:t>
-      </w:r>
-    </w:p>
-    <w:p>
-      <w:pPr>
-        <w:rPr>
-          <w:rFonts w:ascii="Arial" w:hAnsi="Arial" w:cs="Arial"/>
-          <w:sz w:val="24"/>
-          <w:szCs w:val="24"/>
-        </w:rPr>
-      </w:pPr>
-    </w:p>
-    <w:p>
-      <w:pPr>
-        <w:rPr>
-          <w:rFonts w:ascii="Arial" w:hAnsi="Arial" w:cs="Arial"/>
-          <w:sz w:val="24"/>
-          <w:szCs w:val="24"/>
-        </w:rPr>
-      </w:pPr>
-      <w:r>
-        <w:rPr>
-          <w:rFonts w:ascii="Arial" w:hAnsi="Arial" w:cs="Arial"/>
-          <w:sz w:val="24"/>
-          <w:szCs w:val="24"/>
-        </w:rPr>
-        <w:t>La programación orientada a objetos (POO) es un paradigma de programación que se centra en la creación de objetos y su interacción para resolver problemas. En POO, los objetos son entidades que tienen atributos (datos) y métodos (comportamientos) que los definen. Los objetos pueden interactuar entre sí y con el entorno para realizar una tarea específica. POO es una forma eficiente y flexible de escribir programas ya que se pueden reutilizar y extender objetos en diferentes partes del programa.</w:t>
-      </w:r>
-    </w:p>
-    <w:p>
-      <w:pPr>
-        <w:rPr>
-          <w:rFonts w:ascii="Arial" w:hAnsi="Arial" w:cs="Arial"/>
-          <w:sz w:val="24"/>
-          <w:szCs w:val="24"/>
-        </w:rPr>
-      </w:pPr>
-    </w:p>
-    <w:p>
-      <w:pPr>
-        <w:rPr>
-          <w:rFonts w:ascii="Arial" w:hAnsi="Arial" w:cs="Arial"/>
-          <w:sz w:val="24"/>
-          <w:szCs w:val="24"/>
-        </w:rPr>
-      </w:pPr>
     </w:p>
     <w:p>
       <w:pPr>
@@ -1726,6 +1334,135 @@
           <w:sz w:val="24"/>
           <w:szCs w:val="24"/>
         </w:rPr>
+        <w:t>Sobre el asunto del problema o necesidad a resolver:</w:t>
+      </w:r>
+    </w:p>
+    <w:p>
+      <w:pPr>
+        <w:rPr>
+          <w:rFonts w:ascii="Arial" w:hAnsi="Arial" w:cs="Arial"/>
+          <w:sz w:val="24"/>
+          <w:szCs w:val="24"/>
+        </w:rPr>
+      </w:pPr>
+    </w:p>
+    <w:p>
+      <w:pPr>
+        <w:rPr>
+          <w:rFonts w:ascii="Arial" w:hAnsi="Arial" w:cs="Arial"/>
+          <w:sz w:val="24"/>
+          <w:szCs w:val="24"/>
+        </w:rPr>
+      </w:pPr>
+      <w:r>
+        <w:rPr>
+          <w:rFonts w:ascii="Arial" w:hAnsi="Arial" w:cs="Arial"/>
+          <w:sz w:val="24"/>
+          <w:szCs w:val="24"/>
+        </w:rPr>
+        <w:t>La dislexia es un trastorno del aprendizaje que afecta a la habilidad de una persona para leer, escribir y deletrear correctamente. Esta dificultad puede afectar el desempeño académico y la autoestima de la persona, ya que puede llevar a un retraso en el aprendizaje y a la frustración. Por lo tanto, es importante contar con herramientas y recursos que puedan ayudar a las personas con dislexia a superar estas dificultades y mejorar sus habilidades de lectura y escritura.</w:t>
+      </w:r>
+    </w:p>
+    <w:p>
+      <w:pPr>
+        <w:rPr>
+          <w:rFonts w:ascii="Arial" w:hAnsi="Arial" w:cs="Arial"/>
+          <w:sz w:val="24"/>
+          <w:szCs w:val="24"/>
+        </w:rPr>
+      </w:pPr>
+    </w:p>
+    <w:p>
+      <w:pPr>
+        <w:rPr>
+          <w:rFonts w:ascii="Arial" w:hAnsi="Arial" w:cs="Arial"/>
+          <w:sz w:val="24"/>
+          <w:szCs w:val="24"/>
+        </w:rPr>
+      </w:pPr>
+      <w:r>
+        <w:rPr>
+          <w:rFonts w:ascii="Arial" w:hAnsi="Arial" w:cs="Arial"/>
+          <w:sz w:val="24"/>
+          <w:szCs w:val="24"/>
+        </w:rPr>
+        <w:t>-</w:t>
+      </w:r>
+      <w:r>
+        <w:rPr>
+          <w:rFonts w:ascii="Arial" w:hAnsi="Arial" w:cs="Arial"/>
+          <w:sz w:val="24"/>
+          <w:szCs w:val="24"/>
+        </w:rPr>
+        <w:t>Sobre Programación Orientada a Objetos:</w:t>
+      </w:r>
+    </w:p>
+    <w:p>
+      <w:pPr>
+        <w:rPr>
+          <w:rFonts w:ascii="Arial" w:hAnsi="Arial" w:cs="Arial"/>
+          <w:sz w:val="24"/>
+          <w:szCs w:val="24"/>
+        </w:rPr>
+      </w:pPr>
+    </w:p>
+    <w:p>
+      <w:pPr>
+        <w:rPr>
+          <w:rFonts w:ascii="Arial" w:hAnsi="Arial" w:cs="Arial"/>
+          <w:sz w:val="24"/>
+          <w:szCs w:val="24"/>
+        </w:rPr>
+      </w:pPr>
+      <w:r>
+        <w:rPr>
+          <w:rFonts w:ascii="Arial" w:hAnsi="Arial" w:cs="Arial"/>
+          <w:sz w:val="24"/>
+          <w:szCs w:val="24"/>
+        </w:rPr>
+        <w:t>La programación orientada a objetos (POO) es un paradigma de programación que se centra en la creación de objetos y su interacción para resolver problemas. En POO, los objetos son entidades que tienen atributos (datos) y métodos (comportamientos) que los definen. Los objetos pueden interactuar entre sí y con el entorno para realizar una tarea específica. POO es una forma eficiente y flexible de escribir programas ya que se pueden reutilizar y extender objetos en diferentes partes del programa.</w:t>
+      </w:r>
+    </w:p>
+    <w:p>
+      <w:pPr>
+        <w:rPr>
+          <w:rFonts w:ascii="Arial" w:hAnsi="Arial" w:cs="Arial"/>
+          <w:sz w:val="24"/>
+          <w:szCs w:val="24"/>
+        </w:rPr>
+      </w:pPr>
+    </w:p>
+    <w:p>
+      <w:pPr>
+        <w:rPr>
+          <w:rFonts w:ascii="Arial" w:hAnsi="Arial" w:cs="Arial"/>
+          <w:sz w:val="24"/>
+          <w:szCs w:val="24"/>
+        </w:rPr>
+      </w:pPr>
+    </w:p>
+    <w:p>
+      <w:pPr>
+        <w:rPr>
+          <w:rFonts w:ascii="Arial" w:hAnsi="Arial" w:cs="Arial"/>
+          <w:sz w:val="24"/>
+          <w:szCs w:val="24"/>
+        </w:rPr>
+      </w:pPr>
+      <w:r>
+        <w:rPr>
+          <w:rFonts w:ascii="Arial" w:hAnsi="Arial" w:cs="Arial"/>
+          <w:sz w:val="24"/>
+          <w:szCs w:val="24"/>
+        </w:rPr>
+        <w:t>-</w:t>
+      </w:r>
+      <w:r>
+        <w:rPr>
+          <w:rFonts w:ascii="Arial" w:hAnsi="Arial" w:cs="Arial"/>
+          <w:sz w:val="24"/>
+          <w:szCs w:val="24"/>
+        </w:rPr>
         <w:t>Sobre el lenguaje Java:</w:t>
       </w:r>
     </w:p>
@@ -1778,17 +1515,16 @@
           <w:sz w:val="24"/>
           <w:szCs w:val="24"/>
         </w:rPr>
-        <w:t>En resumen, la programación orientada a objetos y el lenguaje Java son herramientas poderosas para la creación de programas que pueden ayudar a las personas con dislexia a mejorar sus habilidades de lectura y escritura. La programación orientada a objetos permite crear objetos personalizados y adaptados a las necesidades de los usuarios, mientras q</w:t>
-      </w:r>
-      <w:bookmarkStart w:id="2" w:name="_GoBack"/>
-      <w:bookmarkEnd w:id="2"/>
-      <w:r>
-        <w:rPr>
-          <w:rFonts w:ascii="Arial" w:hAnsi="Arial" w:cs="Arial"/>
-          <w:sz w:val="24"/>
-          <w:szCs w:val="24"/>
-        </w:rPr>
-        <w:t>ue Java ofrece una plataforma segura, portátil y fácil de usar para la implementación de aplicaciones.</w:t>
+        <w:t xml:space="preserve">En resumen, la programación orientada a objetos y el lenguaje Java son herramientas poderosas para la creación de programas que pueden ayudar a las personas con dislexia a mejorar sus habilidades de lectura y escritura. La </w:t>
+      </w:r>
+      <w:r>
+        <w:rPr>
+          <w:rFonts w:ascii="Arial" w:hAnsi="Arial" w:cs="Arial"/>
+          <w:sz w:val="24"/>
+          <w:szCs w:val="24"/>
+        </w:rPr>
+        <w:lastRenderedPageBreak/>
+        <w:t>programación orientada a objetos permite crear objetos personalizados y adaptados a las necesidades de los usuarios, mientras que Java ofrece una plataforma segura, portátil y fácil de usar para la implementación de aplicaciones.</w:t>
       </w:r>
     </w:p>
     <w:p>
@@ -1807,195 +1543,153 @@
           <w:b/>
           <w:sz w:val="24"/>
           <w:szCs w:val="24"/>
-        </w:rPr>
-      </w:pPr>
+          <w:lang w:val="en-US"/>
+        </w:rPr>
+      </w:pPr>
+      <w:proofErr w:type="spellStart"/>
       <w:r>
         <w:rPr>
           <w:rFonts w:ascii="Arial" w:hAnsi="Arial" w:cs="Arial"/>
           <w:b/>
           <w:sz w:val="24"/>
           <w:szCs w:val="24"/>
-        </w:rPr>
-        <w:t>Web</w:t>
-      </w:r>
-      <w:r>
-        <w:rPr>
-          <w:rFonts w:ascii="Arial" w:hAnsi="Arial" w:cs="Arial"/>
-          <w:b/>
-          <w:sz w:val="24"/>
-          <w:szCs w:val="24"/>
-        </w:rPr>
-        <w:t>grafía</w:t>
-      </w:r>
-    </w:p>
-    <w:p>
-      <w:pPr>
-        <w:rPr>
-          <w:rFonts w:ascii="Arial" w:hAnsi="Arial" w:cs="Arial"/>
-          <w:sz w:val="24"/>
-          <w:szCs w:val="24"/>
-        </w:rPr>
-      </w:pPr>
-      <w:r>
-        <w:rPr>
-          <w:rFonts w:ascii="Arial" w:hAnsi="Arial" w:cs="Arial"/>
-          <w:sz w:val="24"/>
-          <w:szCs w:val="24"/>
-        </w:rPr>
-        <w:t xml:space="preserve">Asociación Dislexia y Familia. (s.f.). Qué es la dislexia. </w:t>
-      </w:r>
-      <w:r>
-        <w:rPr>
-          <w:rFonts w:ascii="Arial" w:hAnsi="Arial" w:cs="Arial"/>
-          <w:sz w:val="24"/>
-          <w:szCs w:val="24"/>
-        </w:rPr>
-        <w:t>https://www.understood.org/es-mx/articles/what-is-dyslexia</w:t>
-      </w:r>
-    </w:p>
-    <w:p>
-      <w:pPr>
-        <w:rPr>
-          <w:rFonts w:ascii="Arial" w:hAnsi="Arial" w:cs="Arial"/>
-          <w:sz w:val="24"/>
-          <w:szCs w:val="24"/>
-        </w:rPr>
-      </w:pPr>
-      <w:r>
-        <w:rPr>
-          <w:rFonts w:ascii="Arial" w:hAnsi="Arial" w:cs="Arial"/>
-          <w:sz w:val="24"/>
-          <w:szCs w:val="24"/>
-        </w:rPr>
-        <w:t xml:space="preserve">Confederación Española de Asociaciones de Padres y Madres del Alumnado (CEAPA). (2017). Guía sobre la dislexia para familias y </w:t>
-      </w:r>
-      <w:r>
-        <w:rPr>
-          <w:rFonts w:ascii="Arial" w:hAnsi="Arial" w:cs="Arial"/>
-          <w:sz w:val="24"/>
-          <w:szCs w:val="24"/>
-          <w:u w:val="single"/>
-        </w:rPr>
-        <w:t>docentes</w:t>
-      </w:r>
-      <w:r>
-        <w:rPr>
-          <w:rFonts w:ascii="Arial" w:hAnsi="Arial" w:cs="Arial"/>
-          <w:sz w:val="24"/>
-          <w:szCs w:val="24"/>
-        </w:rPr>
-        <w:t xml:space="preserve">. </w:t>
-      </w:r>
-      <w:r>
-        <w:rPr>
-          <w:rFonts w:ascii="Arial" w:hAnsi="Arial" w:cs="Arial"/>
-          <w:sz w:val="24"/>
-          <w:szCs w:val="24"/>
-        </w:rPr>
-        <w:t>https://ciec.edu.co/ciec-new/observatorio/pedagogia-e-innovacion/dislexia-guia-basica-para-el-profesorado/</w:t>
-      </w:r>
-    </w:p>
-    <w:p>
-      <w:pPr>
-        <w:rPr>
-          <w:rFonts w:ascii="Arial" w:hAnsi="Arial" w:cs="Arial"/>
-          <w:sz w:val="24"/>
-          <w:szCs w:val="24"/>
-        </w:rPr>
-      </w:pPr>
-    </w:p>
-    <w:p>
-      <w:pPr>
-        <w:rPr>
-          <w:rFonts w:ascii="Arial" w:hAnsi="Arial" w:cs="Arial"/>
-          <w:sz w:val="24"/>
-          <w:szCs w:val="24"/>
-        </w:rPr>
-      </w:pPr>
-      <w:r>
-        <w:rPr>
-          <w:rFonts w:ascii="Arial" w:hAnsi="Arial" w:cs="Arial"/>
-          <w:sz w:val="24"/>
-          <w:szCs w:val="24"/>
-        </w:rPr>
-        <w:t xml:space="preserve">Psicoactiva. (s.f.). Dislexia: causas, síntomas y tratamiento. </w:t>
-      </w:r>
-      <w:r>
-        <w:rPr>
-          <w:rFonts w:ascii="Arial" w:hAnsi="Arial" w:cs="Arial"/>
-          <w:sz w:val="24"/>
-          <w:szCs w:val="24"/>
-        </w:rPr>
-        <w:t>https://www.terapify.com/blog/la-dislexia-sintomas-causas-y-tratamiento/</w:t>
-      </w:r>
-    </w:p>
-    <w:p>
-      <w:pPr>
-        <w:rPr>
-          <w:rFonts w:ascii="Arial" w:hAnsi="Arial" w:cs="Arial"/>
-          <w:sz w:val="24"/>
-          <w:szCs w:val="24"/>
-        </w:rPr>
-      </w:pPr>
-      <w:r>
-        <w:rPr>
-          <w:rFonts w:ascii="Arial" w:hAnsi="Arial" w:cs="Arial"/>
-          <w:sz w:val="24"/>
-          <w:szCs w:val="24"/>
-        </w:rPr>
-        <w:t xml:space="preserve">Centro de Atención Psicopedagógica Especializada. (s.f.). Dislexia: causas, síntomas y tratamientos. </w:t>
-      </w:r>
-      <w:r>
-        <w:rPr>
-          <w:rFonts w:ascii="Arial" w:hAnsi="Arial" w:cs="Arial"/>
-          <w:sz w:val="24"/>
-          <w:szCs w:val="24"/>
-        </w:rPr>
-        <w:t>https://psicopedia.org/7577/dislexia-causas-sintomas-tratamiento/</w:t>
-      </w:r>
-    </w:p>
-    <w:p>
-      <w:pPr>
-        <w:rPr>
-          <w:rFonts w:ascii="Arial" w:hAnsi="Arial" w:cs="Arial"/>
-          <w:sz w:val="24"/>
-          <w:szCs w:val="24"/>
-        </w:rPr>
-      </w:pPr>
-    </w:p>
-    <w:p>
-      <w:pPr>
-        <w:rPr>
-          <w:rFonts w:ascii="Arial" w:hAnsi="Arial" w:cs="Arial"/>
-          <w:sz w:val="24"/>
-          <w:szCs w:val="24"/>
-        </w:rPr>
-      </w:pPr>
-    </w:p>
-    <w:p>
-      <w:pPr>
-        <w:rPr>
-          <w:rFonts w:ascii="Arial" w:hAnsi="Arial" w:cs="Arial"/>
-          <w:sz w:val="24"/>
-          <w:szCs w:val="24"/>
-        </w:rPr>
-      </w:pPr>
-    </w:p>
-    <w:p>
-      <w:pPr>
-        <w:rPr>
-          <w:rFonts w:ascii="Arial" w:hAnsi="Arial" w:cs="Arial"/>
-          <w:sz w:val="24"/>
-          <w:szCs w:val="24"/>
-        </w:rPr>
-      </w:pPr>
-    </w:p>
-    <w:p>
-      <w:pPr>
-        <w:rPr>
-          <w:rFonts w:ascii="Arial" w:hAnsi="Arial" w:cs="Arial"/>
-          <w:sz w:val="24"/>
-          <w:szCs w:val="24"/>
+          <w:lang w:val="en-US"/>
+        </w:rPr>
+        <w:t>Webgrafía</w:t>
+      </w:r>
+      <w:proofErr w:type="spellEnd"/>
+    </w:p>
+    <w:p>
+      <w:pPr>
+        <w:rPr>
+          <w:rFonts w:ascii="Arial" w:hAnsi="Arial" w:cs="Arial"/>
+          <w:sz w:val="24"/>
+          <w:szCs w:val="24"/>
+        </w:rPr>
+      </w:pPr>
+      <w:r>
+        <w:rPr>
+          <w:rFonts w:ascii="Arial" w:hAnsi="Arial" w:cs="Arial"/>
+          <w:sz w:val="24"/>
+          <w:szCs w:val="24"/>
+          <w:lang w:val="en-US"/>
+        </w:rPr>
+        <w:t xml:space="preserve">International Dyslexia Association (IDA). (2021). The Definition of Dyslexia. </w:t>
+      </w:r>
+      <w:r>
+        <w:rPr>
+          <w:rFonts w:ascii="Arial" w:hAnsi="Arial" w:cs="Arial"/>
+          <w:sz w:val="24"/>
+          <w:szCs w:val="24"/>
+        </w:rPr>
+        <w:t xml:space="preserve">Recuperado de </w:t>
+      </w:r>
+      <w:hyperlink r:id="rId6" w:tgtFrame="_new" w:history="1">
+        <w:r>
+          <w:rPr>
+            <w:rStyle w:val="Hipervnculo"/>
+            <w:rFonts w:ascii="Arial" w:hAnsi="Arial" w:cs="Arial"/>
+            <w:sz w:val="24"/>
+            <w:szCs w:val="24"/>
+          </w:rPr>
+          <w:t>https://dyslexiaida.org/definition-of-dyslexia/</w:t>
+        </w:r>
+      </w:hyperlink>
+    </w:p>
+    <w:p>
+      <w:pPr>
+        <w:rPr>
+          <w:rFonts w:ascii="Arial" w:hAnsi="Arial" w:cs="Arial"/>
+          <w:sz w:val="24"/>
+          <w:szCs w:val="24"/>
+          <w:lang w:val="en-US"/>
+        </w:rPr>
+      </w:pPr>
+      <w:proofErr w:type="spellStart"/>
+      <w:r>
+        <w:rPr>
+          <w:rFonts w:ascii="Arial" w:hAnsi="Arial" w:cs="Arial"/>
+          <w:sz w:val="24"/>
+          <w:szCs w:val="24"/>
+        </w:rPr>
+        <w:t>Shaywitz</w:t>
+      </w:r>
+      <w:proofErr w:type="spellEnd"/>
+      <w:r>
+        <w:rPr>
+          <w:rFonts w:ascii="Arial" w:hAnsi="Arial" w:cs="Arial"/>
+          <w:sz w:val="24"/>
+          <w:szCs w:val="24"/>
+        </w:rPr>
+        <w:t xml:space="preserve">, S. E., &amp; </w:t>
+      </w:r>
+      <w:proofErr w:type="spellStart"/>
+      <w:r>
+        <w:rPr>
+          <w:rFonts w:ascii="Arial" w:hAnsi="Arial" w:cs="Arial"/>
+          <w:sz w:val="24"/>
+          <w:szCs w:val="24"/>
+        </w:rPr>
+        <w:t>Shaywitz</w:t>
+      </w:r>
+      <w:proofErr w:type="spellEnd"/>
+      <w:r>
+        <w:rPr>
+          <w:rFonts w:ascii="Arial" w:hAnsi="Arial" w:cs="Arial"/>
+          <w:sz w:val="24"/>
+          <w:szCs w:val="24"/>
+        </w:rPr>
+        <w:t xml:space="preserve">, B. A. (2020). </w:t>
+      </w:r>
+      <w:r>
+        <w:rPr>
+          <w:rFonts w:ascii="Arial" w:hAnsi="Arial" w:cs="Arial"/>
+          <w:sz w:val="24"/>
+          <w:szCs w:val="24"/>
+          <w:lang w:val="en-US"/>
+        </w:rPr>
+        <w:t xml:space="preserve">Dyslexia (Specific Reading Disability). </w:t>
+      </w:r>
+      <w:proofErr w:type="spellStart"/>
+      <w:r>
+        <w:rPr>
+          <w:rFonts w:ascii="Arial" w:hAnsi="Arial" w:cs="Arial"/>
+          <w:sz w:val="24"/>
+          <w:szCs w:val="24"/>
+          <w:lang w:val="en-US"/>
+        </w:rPr>
+        <w:t>Recuperado</w:t>
+      </w:r>
+      <w:proofErr w:type="spellEnd"/>
+      <w:r>
+        <w:rPr>
+          <w:rFonts w:ascii="Arial" w:hAnsi="Arial" w:cs="Arial"/>
+          <w:sz w:val="24"/>
+          <w:szCs w:val="24"/>
+          <w:lang w:val="en-US"/>
+        </w:rPr>
+        <w:t xml:space="preserve"> de </w:t>
+      </w:r>
+      <w:hyperlink r:id="rId7" w:tgtFrame="_new" w:history="1">
+        <w:r>
+          <w:rPr>
+            <w:rStyle w:val="Hipervnculo"/>
+            <w:rFonts w:ascii="Arial" w:hAnsi="Arial" w:cs="Arial"/>
+            <w:sz w:val="24"/>
+            <w:szCs w:val="24"/>
+            <w:lang w:val="en-US"/>
+          </w:rPr>
+          <w:t>https://www.ncbi.nlm.nih.gov/books/NBK519523/</w:t>
+        </w:r>
+      </w:hyperlink>
+    </w:p>
+    <w:p>
+      <w:pPr>
+        <w:rPr>
+          <w:rFonts w:ascii="Arial" w:hAnsi="Arial" w:cs="Arial"/>
+          <w:sz w:val="24"/>
+          <w:szCs w:val="24"/>
+          <w:lang w:val="en-US"/>
         </w:rPr>
       </w:pPr>
     </w:p>

</xml_diff>